<commit_message>
QC pass: fix cross-refs, schema gaps, and ID convention in walkthrough
5 issues found across 5 review passes and addressed in both the docx
and visual PDF:

1. Pipeline item 5 referenced "agent 3a" but the numbered list has no
   3a — replaced with "same Validator agent as gate #1, second call
   site" so the cross-reference resolves.
2. Validator output schema now enumerates verdict values
   (accept | revise | escalate) and adds a per-field table.
3. Retrieval Generate-out example used singular "theme: G1"
   contradicting the Epic schema's "themes: array" — corrected to
   themes: ["G1","G5"].
4. ID convention (draft vs Jira-shaped) was ambiguous in the Generate
   example — added an explicit note in the schema preamble and a
   pointer in the Generate-out cell.
5. YAML profile sections (pre_analytic / analytic / post_analytic)
   now have a one-line lead-in each so non-LIMS readers know what
   each stage means.

Co-Authored-By: Claude Opus 4.7 (1M context) <noreply@anthropic.com>
</commit_message>
<xml_diff>
--- a/microbio_lims_architecture_walkthrough.docx
+++ b/microbio_lims_architecture_walkthrough.docx
@@ -443,7 +443,7 @@
               <w:jc w:val="left"/>
             </w:pPr>
             <w:r>
-              <w:t xml:space="preserve">Eight content tags that span the LIMS workflow: G1 Pre-Analytic, G2 Analytic, G3 Post-Analytic, G4 Reporting, G5 QC, G6 Compliance, G7 Instrumentation, G8 Platform. Multi-label per chunk (a chunk can carry multiple themes with confidences).</w:t>
+              <w:t xml:space="preserve">Eight content tags that span the LIMS workflow: G1 Pre-Analytic, G2 Analytic, G3 Post-Analytic, G4 Reporting, G5 QC, G6 Compliance, G7 Instrumentation, G8 Platform. Multi-label per chunk (a chunk can carry multiple themes with confidence scores).</w:t>
             </w:r>
           </w:p>
         </w:tc>
@@ -660,7 +660,7 @@
           <wp:inline>
             <wp:extent cx="5334000" cy="1318694"/>
             <wp:effectExtent b="0" l="0" r="0" t="0"/>
-            <wp:docPr descr="Agent pipeline. Five agents run as a single batch over the SOP cohort. The same Validator agent is invoked at two call sites — once per-SOP, once after synthesis." title="" id="23" name="Picture"/>
+            <wp:docPr descr="Agent pipeline. Five agents run as a single batch over the SOP cohort. The same Validator agent is invoked at two call sites — once per-SOP (gate #1), once after synthesis (gate #2)." title="" id="23" name="Picture"/>
             <a:graphic>
               <a:graphicData uri="http://schemas.openxmlformats.org/drawingml/2006/picture">
                 <pic:pic>
@@ -703,7 +703,7 @@
         <w:pStyle w:val="ImageCaption"/>
       </w:pPr>
       <w:r>
-        <w:t xml:space="preserve">Agent pipeline. Five agents run as a single batch over the SOP cohort. The same Validator agent is invoked at two call sites — once per-SOP, once after synthesis.</w:t>
+        <w:t xml:space="preserve">Agent pipeline. Five agents run as a single batch over the SOP cohort. The same Validator agent is invoked at two call sites — once per-SOP (gate #1), once after synthesis (gate #2).</w:t>
       </w:r>
     </w:p>
     <w:p>
@@ -900,7 +900,7 @@
         <w:t xml:space="preserve"> </w:t>
       </w:r>
       <w:r>
-        <w:t xml:space="preserve">— same agent as 3a; capability rubric only. Synthesized stories are a</w:t>
+        <w:t xml:space="preserve">— same Validator agent as gate #1, second call site; applies the capability rubric only. Synthesized stories are a</w:t>
       </w:r>
       <w:r>
         <w:t xml:space="preserve"> </w:t>
@@ -916,7 +916,7 @@
         <w:t xml:space="preserve"> </w:t>
       </w:r>
       <w:r>
-        <w:t xml:space="preserve">artifact, not a derivative of validated input, so they re-pass the bar.</w:t>
+        <w:t xml:space="preserve">artifact (not a derivative of validated input), so they re-pass the bar.</w:t>
       </w:r>
     </w:p>
     <w:p>
@@ -1335,7 +1335,49 @@
         <w:pStyle w:val="FirstParagraph"/>
       </w:pPr>
       <w:r>
-        <w:t xml:space="preserve">Code blocks below are illustrative JSON / YAML; the production representation is JSON-schema-validated before persistence.</w:t>
+        <w:t xml:space="preserve">Code blocks below are illustrative JSON / YAML; the production representation is JSON-schema-validated before persistence. IDs come in two flavors: a draft ID assigned in-pipeline (e.g. </w:t>
+      </w:r>
+      <w:r>
+        <w:rPr>
+          <w:rStyle w:val="VerbatimChar"/>
+        </w:rPr>
+        <w:t xml:space="preserve">epic_draft_3</w:t>
+      </w:r>
+      <w:r>
+        <w:t xml:space="preserve">,</w:t>
+      </w:r>
+      <w:r>
+        <w:t xml:space="preserve"> </w:t>
+      </w:r>
+      <w:r>
+        <w:rPr>
+          <w:rStyle w:val="VerbatimChar"/>
+        </w:rPr>
+        <w:t xml:space="preserve">story_draft_42</w:t>
+      </w:r>
+      <w:r>
+        <w:t xml:space="preserve">) and a final Jira-shaped ID (e.g. </w:t>
+      </w:r>
+      <w:r>
+        <w:rPr>
+          <w:rStyle w:val="VerbatimChar"/>
+        </w:rPr>
+        <w:t xml:space="preserve">EPIC-MICRO-001</w:t>
+      </w:r>
+      <w:r>
+        <w:t xml:space="preserve">,</w:t>
+      </w:r>
+      <w:r>
+        <w:t xml:space="preserve"> </w:t>
+      </w:r>
+      <w:r>
+        <w:rPr>
+          <w:rStyle w:val="VerbatimChar"/>
+        </w:rPr>
+        <w:t xml:space="preserve">STORY-MICRO-1042</w:t>
+      </w:r>
+      <w:r>
+        <w:t xml:space="preserve">) assigned at Jira-push time by the Dependency Resolver.</w:t>
       </w:r>
     </w:p>
     <w:bookmarkStart w:id="30" w:name="epic-schema"/>
@@ -1738,7 +1780,22 @@
               <w:jc w:val="left"/>
             </w:pPr>
             <w:r>
-              <w:t xml:space="preserve">Jira-shaped Epic ID.</w:t>
+              <w:t xml:space="preserve">Final Jira-shaped Epic ID (or</w:t>
+            </w:r>
+            <w:r>
+              <w:t xml:space="preserve"> </w:t>
+            </w:r>
+            <w:r>
+              <w:rPr>
+                <w:rStyle w:val="VerbatimChar"/>
+              </w:rPr>
+              <w:t xml:space="preserve">epic_draft_*</w:t>
+            </w:r>
+            <w:r>
+              <w:t xml:space="preserve"> </w:t>
+            </w:r>
+            <w:r>
+              <w:t xml:space="preserve">while in-pipeline).</w:t>
             </w:r>
           </w:p>
         </w:tc>
@@ -3205,7 +3262,22 @@
               <w:jc w:val="left"/>
             </w:pPr>
             <w:r>
-              <w:t xml:space="preserve">Jira-shaped Story ID.</w:t>
+              <w:t xml:space="preserve">Final Jira-shaped Story ID (or</w:t>
+            </w:r>
+            <w:r>
+              <w:t xml:space="preserve"> </w:t>
+            </w:r>
+            <w:r>
+              <w:rPr>
+                <w:rStyle w:val="VerbatimChar"/>
+              </w:rPr>
+              <w:t xml:space="preserve">story_draft_*</w:t>
+            </w:r>
+            <w:r>
+              <w:t xml:space="preserve"> </w:t>
+            </w:r>
+            <w:r>
+              <w:t xml:space="preserve">while in-pipeline).</w:t>
             </w:r>
           </w:p>
         </w:tc>
@@ -3465,7 +3537,7 @@
               <w:jc w:val="left"/>
             </w:pPr>
             <w:r>
-              <w:t xml:space="preserve">User story format preferred for capability/stage-split; descriptive prose for config-instance/cleanup.</w:t>
+              <w:t xml:space="preserve">User-story format preferred for capability/stage-split; descriptive prose for config-instance/cleanup.</w:t>
             </w:r>
           </w:p>
         </w:tc>
@@ -3914,7 +3986,7 @@
               <w:jc w:val="left"/>
             </w:pPr>
             <w:r>
-              <w:t xml:space="preserve">Surfaced corner cases the SOP / rules engine should handle.</w:t>
+              <w:t xml:space="preserve">Surfaced corner cases.</w:t>
             </w:r>
           </w:p>
         </w:tc>
@@ -4003,7 +4075,7 @@
               <w:t xml:space="preserve">ready</w:t>
             </w:r>
             <w:r>
-              <w:t xml:space="preserve">. Validated = passed the gate; ready = SME-accepted.</w:t>
+              <w:t xml:space="preserve">. Validated = passed the Validator gate; ready = SME-accepted.</w:t>
             </w:r>
           </w:p>
         </w:tc>
@@ -4416,13 +4488,13 @@
       </w:r>
     </w:p>
     <w:bookmarkEnd w:id="32"/>
-    <w:bookmarkStart w:id="33" w:name="X55d34e6ea319dafed5c70ffbb4f7a2582133378"/>
+    <w:bookmarkStart w:id="33" w:name="validator-output-schema"/>
     <w:p>
       <w:pPr>
         <w:pStyle w:val="Heading2"/>
       </w:pPr>
       <w:r>
-        <w:t xml:space="preserve">Validator output schema (when a Story fails)</w:t>
+        <w:t xml:space="preserve">Validator output schema</w:t>
       </w:r>
     </w:p>
     <w:p>
@@ -4952,6 +5024,413 @@
         <w:t xml:space="preserve">}</w:t>
       </w:r>
     </w:p>
+    <w:tbl>
+      <w:tblPr>
+        <w:tblStyle w:val="Table"/>
+        <w:tblW w:type="pct" w:w="5000"/>
+        <w:tblLook w:firstRow="1" w:lastRow="0" w:firstColumn="0" w:lastColumn="0" w:noHBand="0" w:noVBand="0" w:val="0020"/>
+      </w:tblPr>
+      <w:tblGrid>
+        <w:gridCol w:w="2640"/>
+        <w:gridCol w:w="2640"/>
+        <w:gridCol w:w="2640"/>
+      </w:tblGrid>
+      <w:tr>
+        <w:trPr>
+          <w:tblHeader w:val="true"/>
+        </w:trPr>
+        <w:tc>
+          <w:tcPr/>
+          <w:p>
+            <w:pPr>
+              <w:pStyle w:val="Compact"/>
+              <w:jc w:val="left"/>
+            </w:pPr>
+            <w:r>
+              <w:t xml:space="preserve">Field</w:t>
+            </w:r>
+          </w:p>
+        </w:tc>
+        <w:tc>
+          <w:tcPr/>
+          <w:p>
+            <w:pPr>
+              <w:pStyle w:val="Compact"/>
+              <w:jc w:val="left"/>
+            </w:pPr>
+            <w:r>
+              <w:t xml:space="preserve">Type</w:t>
+            </w:r>
+          </w:p>
+        </w:tc>
+        <w:tc>
+          <w:tcPr/>
+          <w:p>
+            <w:pPr>
+              <w:pStyle w:val="Compact"/>
+              <w:jc w:val="left"/>
+            </w:pPr>
+            <w:r>
+              <w:t xml:space="preserve">Notes</w:t>
+            </w:r>
+          </w:p>
+        </w:tc>
+      </w:tr>
+      <w:tr>
+        <w:tc>
+          <w:tcPr/>
+          <w:p>
+            <w:pPr>
+              <w:pStyle w:val="Compact"/>
+              <w:jc w:val="left"/>
+            </w:pPr>
+            <w:r>
+              <w:rPr>
+                <w:rStyle w:val="VerbatimChar"/>
+              </w:rPr>
+              <w:t xml:space="preserve">story_id</w:t>
+            </w:r>
+          </w:p>
+        </w:tc>
+        <w:tc>
+          <w:tcPr/>
+          <w:p>
+            <w:pPr>
+              <w:pStyle w:val="Compact"/>
+              <w:jc w:val="left"/>
+            </w:pPr>
+            <w:r>
+              <w:t xml:space="preserve">string</w:t>
+            </w:r>
+          </w:p>
+        </w:tc>
+        <w:tc>
+          <w:tcPr/>
+          <w:p>
+            <w:pPr>
+              <w:pStyle w:val="Compact"/>
+              <w:jc w:val="left"/>
+            </w:pPr>
+            <w:r>
+              <w:t xml:space="preserve">The Story under review.</w:t>
+            </w:r>
+          </w:p>
+        </w:tc>
+      </w:tr>
+      <w:tr>
+        <w:tc>
+          <w:tcPr/>
+          <w:p>
+            <w:pPr>
+              <w:pStyle w:val="Compact"/>
+              <w:jc w:val="left"/>
+            </w:pPr>
+            <w:r>
+              <w:rPr>
+                <w:rStyle w:val="VerbatimChar"/>
+              </w:rPr>
+              <w:t xml:space="preserve">verdict</w:t>
+            </w:r>
+          </w:p>
+        </w:tc>
+        <w:tc>
+          <w:tcPr/>
+          <w:p>
+            <w:pPr>
+              <w:pStyle w:val="Compact"/>
+              <w:jc w:val="left"/>
+            </w:pPr>
+            <w:r>
+              <w:t xml:space="preserve">enum</w:t>
+            </w:r>
+          </w:p>
+        </w:tc>
+        <w:tc>
+          <w:tcPr/>
+          <w:p>
+            <w:pPr>
+              <w:pStyle w:val="Compact"/>
+              <w:jc w:val="left"/>
+            </w:pPr>
+            <w:r>
+              <w:rPr>
+                <w:rStyle w:val="VerbatimChar"/>
+              </w:rPr>
+              <w:t xml:space="preserve">accept</w:t>
+            </w:r>
+            <w:r>
+              <w:t xml:space="preserve"> </w:t>
+            </w:r>
+            <w:r>
+              <w:t xml:space="preserve">(story passes),</w:t>
+            </w:r>
+            <w:r>
+              <w:t xml:space="preserve"> </w:t>
+            </w:r>
+            <w:r>
+              <w:rPr>
+                <w:rStyle w:val="VerbatimChar"/>
+              </w:rPr>
+              <w:t xml:space="preserve">revise</w:t>
+            </w:r>
+            <w:r>
+              <w:t xml:space="preserve"> </w:t>
+            </w:r>
+            <w:r>
+              <w:t xml:space="preserve">(return to extractor with</w:t>
+            </w:r>
+            <w:r>
+              <w:t xml:space="preserve"> </w:t>
+            </w:r>
+            <w:r>
+              <w:rPr>
+                <w:rStyle w:val="VerbatimChar"/>
+              </w:rPr>
+              <w:t xml:space="preserve">failed_checks</w:t>
+            </w:r>
+            <w:r>
+              <w:t xml:space="preserve">, attempt &lt; 2), or</w:t>
+            </w:r>
+            <w:r>
+              <w:t xml:space="preserve"> </w:t>
+            </w:r>
+            <w:r>
+              <w:rPr>
+                <w:rStyle w:val="VerbatimChar"/>
+              </w:rPr>
+              <w:t xml:space="preserve">escalate</w:t>
+            </w:r>
+            <w:r>
+              <w:t xml:space="preserve"> </w:t>
+            </w:r>
+            <w:r>
+              <w:t xml:space="preserve">(after 2 failed revisions; routed to SME).</w:t>
+            </w:r>
+          </w:p>
+        </w:tc>
+      </w:tr>
+      <w:tr>
+        <w:tc>
+          <w:tcPr/>
+          <w:p>
+            <w:pPr>
+              <w:pStyle w:val="Compact"/>
+              <w:jc w:val="left"/>
+            </w:pPr>
+            <w:r>
+              <w:rPr>
+                <w:rStyle w:val="VerbatimChar"/>
+              </w:rPr>
+              <w:t xml:space="preserve">shape_declared</w:t>
+            </w:r>
+          </w:p>
+        </w:tc>
+        <w:tc>
+          <w:tcPr/>
+          <w:p>
+            <w:pPr>
+              <w:pStyle w:val="Compact"/>
+              <w:jc w:val="left"/>
+            </w:pPr>
+            <w:r>
+              <w:t xml:space="preserve">enum</w:t>
+            </w:r>
+          </w:p>
+        </w:tc>
+        <w:tc>
+          <w:tcPr/>
+          <w:p>
+            <w:pPr>
+              <w:pStyle w:val="Compact"/>
+              <w:jc w:val="left"/>
+            </w:pPr>
+            <w:r>
+              <w:t xml:space="preserve">The shape the Story Extractor assigned.</w:t>
+            </w:r>
+          </w:p>
+        </w:tc>
+      </w:tr>
+      <w:tr>
+        <w:tc>
+          <w:tcPr/>
+          <w:p>
+            <w:pPr>
+              <w:pStyle w:val="Compact"/>
+              <w:jc w:val="left"/>
+            </w:pPr>
+            <w:r>
+              <w:rPr>
+                <w:rStyle w:val="VerbatimChar"/>
+              </w:rPr>
+              <w:t xml:space="preserve">shape_verified</w:t>
+            </w:r>
+          </w:p>
+        </w:tc>
+        <w:tc>
+          <w:tcPr/>
+          <w:p>
+            <w:pPr>
+              <w:pStyle w:val="Compact"/>
+              <w:jc w:val="left"/>
+            </w:pPr>
+            <w:r>
+              <w:t xml:space="preserve">enum</w:t>
+            </w:r>
+          </w:p>
+        </w:tc>
+        <w:tc>
+          <w:tcPr/>
+          <w:p>
+            <w:pPr>
+              <w:pStyle w:val="Compact"/>
+              <w:jc w:val="left"/>
+            </w:pPr>
+            <w:r>
+              <w:t xml:space="preserve">The shape the Validator believes is correct. If it differs from</w:t>
+            </w:r>
+            <w:r>
+              <w:t xml:space="preserve"> </w:t>
+            </w:r>
+            <w:r>
+              <w:rPr>
+                <w:rStyle w:val="VerbatimChar"/>
+              </w:rPr>
+              <w:t xml:space="preserve">shape_declared</w:t>
+            </w:r>
+            <w:r>
+              <w:t xml:space="preserve">, the verdict is automatically</w:t>
+            </w:r>
+            <w:r>
+              <w:t xml:space="preserve"> </w:t>
+            </w:r>
+            <w:r>
+              <w:rPr>
+                <w:rStyle w:val="VerbatimChar"/>
+              </w:rPr>
+              <w:t xml:space="preserve">revise</w:t>
+            </w:r>
+            <w:r>
+              <w:t xml:space="preserve">.</w:t>
+            </w:r>
+          </w:p>
+        </w:tc>
+      </w:tr>
+      <w:tr>
+        <w:tc>
+          <w:tcPr/>
+          <w:p>
+            <w:pPr>
+              <w:pStyle w:val="Compact"/>
+              <w:jc w:val="left"/>
+            </w:pPr>
+            <w:r>
+              <w:rPr>
+                <w:rStyle w:val="VerbatimChar"/>
+              </w:rPr>
+              <w:t xml:space="preserve">failed_checks[]</w:t>
+            </w:r>
+          </w:p>
+        </w:tc>
+        <w:tc>
+          <w:tcPr/>
+          <w:p>
+            <w:pPr>
+              <w:pStyle w:val="Compact"/>
+              <w:jc w:val="left"/>
+            </w:pPr>
+            <w:r>
+              <w:t xml:space="preserve">array of</w:t>
+            </w:r>
+            <w:r>
+              <w:t xml:space="preserve"> </w:t>
+            </w:r>
+            <w:r>
+              <w:rPr>
+                <w:rStyle w:val="VerbatimChar"/>
+              </w:rPr>
+              <w:t xml:space="preserve">{rule, severity, message}</w:t>
+            </w:r>
+          </w:p>
+        </w:tc>
+        <w:tc>
+          <w:tcPr/>
+          <w:p>
+            <w:pPr>
+              <w:pStyle w:val="Compact"/>
+              <w:jc w:val="left"/>
+            </w:pPr>
+            <w:r>
+              <w:t xml:space="preserve">Empty when</w:t>
+            </w:r>
+            <w:r>
+              <w:t xml:space="preserve"> </w:t>
+            </w:r>
+            <w:r>
+              <w:rPr>
+                <w:rStyle w:val="VerbatimChar"/>
+              </w:rPr>
+              <w:t xml:space="preserve">verdict = accept</w:t>
+            </w:r>
+            <w:r>
+              <w:t xml:space="preserve">.</w:t>
+            </w:r>
+          </w:p>
+        </w:tc>
+      </w:tr>
+      <w:tr>
+        <w:tc>
+          <w:tcPr/>
+          <w:p>
+            <w:pPr>
+              <w:pStyle w:val="Compact"/>
+              <w:jc w:val="left"/>
+            </w:pPr>
+            <w:r>
+              <w:rPr>
+                <w:rStyle w:val="VerbatimChar"/>
+              </w:rPr>
+              <w:t xml:space="preserve">attempt</w:t>
+            </w:r>
+          </w:p>
+        </w:tc>
+        <w:tc>
+          <w:tcPr/>
+          <w:p>
+            <w:pPr>
+              <w:pStyle w:val="Compact"/>
+              <w:jc w:val="left"/>
+            </w:pPr>
+            <w:r>
+              <w:t xml:space="preserve">integer</w:t>
+            </w:r>
+          </w:p>
+        </w:tc>
+        <w:tc>
+          <w:tcPr/>
+          <w:p>
+            <w:pPr>
+              <w:pStyle w:val="Compact"/>
+              <w:jc w:val="left"/>
+            </w:pPr>
+            <w:r>
+              <w:t xml:space="preserve">1 or 2 (after 2, the verdict becomes</w:t>
+            </w:r>
+            <w:r>
+              <w:t xml:space="preserve"> </w:t>
+            </w:r>
+            <w:r>
+              <w:rPr>
+                <w:rStyle w:val="VerbatimChar"/>
+              </w:rPr>
+              <w:t xml:space="preserve">escalate</w:t>
+            </w:r>
+            <w:r>
+              <w:t xml:space="preserve">).</w:t>
+            </w:r>
+          </w:p>
+        </w:tc>
+      </w:tr>
+    </w:tbl>
     <w:bookmarkEnd w:id="33"/>
     <w:bookmarkEnd w:id="34"/>
     <w:bookmarkStart w:id="38" w:name="story-relationships-graph-view"/>
@@ -6387,7 +6866,40 @@
               <w:rPr>
                 <w:rStyle w:val="VerbatimChar"/>
               </w:rPr>
-              <w:t xml:space="preserve">{ epic_id: epic_draft_3, title: "Specimen Rejection Workflow", theme: G1, citations: ["s3://.../SOP-MICRO-007 §AC", "s3://.../SOP-CYTO-021 §Procedure", "CLSI M22 §3.4"], stories: ["Validate transport temp", "Flag specimens older than 4h", ...] }</w:t>
+              <w:t xml:space="preserve">{ id: "epic_draft_3", title: "Specimen Rejection Workflow", themes: ["G1", "G5"], citations: ["s3://.../SOP-MICRO-007 §AC", "s3://.../SOP-CYTO-021 §Procedure", "CLSI M22 §3.4"], stories: [{title: "Validate transport temp", ...}, {title: "Flag specimens older than 4h", ...}] }</w:t>
+            </w:r>
+            <w:r>
+              <w:t xml:space="preserve">. The</w:t>
+            </w:r>
+            <w:r>
+              <w:t xml:space="preserve"> </w:t>
+            </w:r>
+            <w:r>
+              <w:rPr>
+                <w:rStyle w:val="VerbatimChar"/>
+              </w:rPr>
+              <w:t xml:space="preserve">id</w:t>
+            </w:r>
+            <w:r>
+              <w:t xml:space="preserve"> </w:t>
+            </w:r>
+            <w:r>
+              <w:t xml:space="preserve">is a draft ID at this stage — the Dependency Resolver replaces it with the final</w:t>
+            </w:r>
+            <w:r>
+              <w:t xml:space="preserve"> </w:t>
+            </w:r>
+            <w:r>
+              <w:rPr>
+                <w:rStyle w:val="VerbatimChar"/>
+              </w:rPr>
+              <w:t xml:space="preserve">EPIC-MICRO-*</w:t>
+            </w:r>
+            <w:r>
+              <w:t xml:space="preserve"> </w:t>
+            </w:r>
+            <w:r>
+              <w:t xml:space="preserve">form before Jira push.</w:t>
             </w:r>
           </w:p>
         </w:tc>
@@ -6706,6 +7218,83 @@
       </w:r>
       <w:r>
         <w:t xml:space="preserve">, so a single source of truth is preserved.</w:t>
+      </w:r>
+    </w:p>
+    <w:p>
+      <w:pPr>
+        <w:pStyle w:val="BodyText"/>
+      </w:pPr>
+      <w:r>
+        <w:t xml:space="preserve">The profile is partitioned by workflow stage so that an engineer can find the right block at a glance:</w:t>
+      </w:r>
+    </w:p>
+    <w:p>
+      <w:pPr>
+        <w:numPr>
+          <w:ilvl w:val="0"/>
+          <w:numId w:val="1005"/>
+        </w:numPr>
+        <w:pStyle w:val="Compact"/>
+      </w:pPr>
+      <w:r>
+        <w:rPr>
+          <w:rStyle w:val="VerbatimChar"/>
+          <w:bCs/>
+          <w:b/>
+        </w:rPr>
+        <w:t xml:space="preserve">pre_analytic</w:t>
+      </w:r>
+      <w:r>
+        <w:t xml:space="preserve"> </w:t>
+      </w:r>
+      <w:r>
+        <w:t xml:space="preserve">— what happens before the specimen reaches the bench: collection, transport, rejection predicates.</w:t>
+      </w:r>
+    </w:p>
+    <w:p>
+      <w:pPr>
+        <w:numPr>
+          <w:ilvl w:val="0"/>
+          <w:numId w:val="1005"/>
+        </w:numPr>
+        <w:pStyle w:val="Compact"/>
+      </w:pPr>
+      <w:r>
+        <w:rPr>
+          <w:rStyle w:val="VerbatimChar"/>
+          <w:bCs/>
+          <w:b/>
+        </w:rPr>
+        <w:t xml:space="preserve">analytic</w:t>
+      </w:r>
+      <w:r>
+        <w:t xml:space="preserve"> </w:t>
+      </w:r>
+      <w:r>
+        <w:t xml:space="preserve">— the bench work itself: centrifugation, inoculation, incubation.</w:t>
+      </w:r>
+    </w:p>
+    <w:p>
+      <w:pPr>
+        <w:numPr>
+          <w:ilvl w:val="0"/>
+          <w:numId w:val="1005"/>
+        </w:numPr>
+        <w:pStyle w:val="Compact"/>
+      </w:pPr>
+      <w:r>
+        <w:rPr>
+          <w:rStyle w:val="VerbatimChar"/>
+          <w:bCs/>
+          <w:b/>
+        </w:rPr>
+        <w:t xml:space="preserve">post_analytic</w:t>
+      </w:r>
+      <w:r>
+        <w:t xml:space="preserve"> </w:t>
+      </w:r>
+      <w:r>
+        <w:t xml:space="preserve">— what happens after the result: reporting thresholds, downstream notifications.</w:t>
       </w:r>
     </w:p>
     <w:bookmarkStart w:id="60" w:name="full-profile-structure"/>
@@ -9529,6 +10118,9 @@
     <w:abstractNumId w:val="991"/>
   </w:num>
   <w:num w:numId="1004">
+    <w:abstractNumId w:val="991"/>
+  </w:num>
+  <w:num w:numId="1005">
     <w:abstractNumId w:val="991"/>
   </w:num>
 </w:numbering>

</xml_diff>